<commit_message>
Publish cinematic case study and measured release evidence
</commit_message>
<xml_diff>
--- a/apps/web/public/downloads/TEMT-Product-Case-Study.docx
+++ b/apps/web/public/downloads/TEMT-Product-Case-Study.docx
@@ -25,49 +25,131 @@
         <w:pStyle w:val="Subtitle"/>
       </w:pPr>
       <w:r>
-        <w:t>A working enterprise experience for India's sustainability and supply-chain teams.</w:t>
+        <w:t>A cinematic product experience for India's sustainability and supply-chain teams.</w:t>
       </w:r>
     </w:p>
-    <w:p>
-      <w:pPr>
-        <w:pStyle w:val="Figure"/>
-        <w:jc w:val="center"/>
-      </w:pPr>
-      <w:r>
-        <w:drawing>
-          <wp:inline xmlns:a="http://schemas.openxmlformats.org/drawingml/2006/main" xmlns:pic="http://schemas.openxmlformats.org/drawingml/2006/picture">
-            <wp:extent cx="4476902" cy="3108960"/>
-            <wp:docPr id="1" name="Picture 1" descr="The finished TEMT landing page with freight imagery, enterprise proposition, primary CTA and interactive road-to-rail estimate."/>
-            <wp:cNvGraphicFramePr>
-              <a:graphicFrameLocks noChangeAspect="1"/>
-            </wp:cNvGraphicFramePr>
-            <a:graphic>
-              <a:graphicData uri="http://schemas.openxmlformats.org/drawingml/2006/picture">
-                <pic:pic>
-                  <pic:nvPicPr>
-                    <pic:cNvPr id="0" name="hero-desktop.jpg"/>
-                    <pic:cNvPicPr/>
-                  </pic:nvPicPr>
-                  <pic:blipFill>
-                    <a:blip r:embed="rId11"/>
-                    <a:stretch>
-                      <a:fillRect/>
-                    </a:stretch>
-                  </pic:blipFill>
-                  <pic:spPr>
-                    <a:xfrm>
-                      <a:off x="0" y="0"/>
-                      <a:ext cx="4476902" cy="3108960"/>
-                    </a:xfrm>
-                    <a:prstGeom prst="rect"/>
-                  </pic:spPr>
-                </pic:pic>
-              </a:graphicData>
-            </a:graphic>
-          </wp:inline>
-        </w:drawing>
-      </w:r>
-    </w:p>
+    <w:tbl>
+      <w:tblPr>
+        <w:tblW w:type="dxa" w:w="9360"/>
+        <w:tblLayout w:type="fixed"/>
+        <w:tblLook w:firstColumn="1" w:firstRow="1" w:lastColumn="0" w:lastRow="0" w:noHBand="0" w:noVBand="1" w:val="04A0"/>
+        <w:tblCellMar>
+          <w:top w:w="0" w:type="dxa"/>
+          <w:bottom w:w="0" w:type="dxa"/>
+          <w:start w:w="0" w:type="dxa"/>
+          <w:end w:w="0" w:type="dxa"/>
+        </w:tblCellMar>
+        <w:tblBorders>
+          <w:top w:val="nil"/>
+          <w:bottom w:val="nil"/>
+          <w:left w:val="nil"/>
+          <w:right w:val="nil"/>
+          <w:insideH w:val="nil"/>
+          <w:insideV w:val="nil"/>
+        </w:tblBorders>
+      </w:tblPr>
+      <w:tblGrid>
+        <w:gridCol w:w="7352"/>
+        <w:gridCol w:w="2008"/>
+      </w:tblGrid>
+      <w:tr>
+        <w:trPr>
+          <w:cantSplit/>
+        </w:trPr>
+        <w:tc>
+          <w:tcPr>
+            <w:tcW w:type="dxa" w:w="7352"/>
+            <w:vAlign w:val="center"/>
+          </w:tcPr>
+          <w:p>
+            <w:pPr>
+              <w:pStyle w:val="Figure"/>
+              <w:jc w:val="center"/>
+            </w:pPr>
+            <w:r>
+              <w:drawing>
+                <wp:inline xmlns:a="http://schemas.openxmlformats.org/drawingml/2006/main" xmlns:pic="http://schemas.openxmlformats.org/drawingml/2006/picture">
+                  <wp:extent cx="4352544" cy="3022600"/>
+                  <wp:docPr id="1" name="Picture 1" descr="The revised desktop TEMT hero with an illustrative freight network, four story chapters and a working estimator."/>
+                  <wp:cNvGraphicFramePr>
+                    <a:graphicFrameLocks noChangeAspect="1"/>
+                  </wp:cNvGraphicFramePr>
+                  <a:graphic>
+                    <a:graphicData uri="http://schemas.openxmlformats.org/drawingml/2006/picture">
+                      <pic:pic>
+                        <pic:nvPicPr>
+                          <pic:cNvPr id="0" name="image.jpg"/>
+                          <pic:cNvPicPr/>
+                        </pic:nvPicPr>
+                        <pic:blipFill>
+                          <a:blip r:embed="rId11"/>
+                          <a:stretch>
+                            <a:fillRect/>
+                          </a:stretch>
+                        </pic:blipFill>
+                        <pic:spPr>
+                          <a:xfrm>
+                            <a:off x="0" y="0"/>
+                            <a:ext cx="4352544" cy="3022600"/>
+                          </a:xfrm>
+                          <a:prstGeom prst="rect"/>
+                        </pic:spPr>
+                      </pic:pic>
+                    </a:graphicData>
+                  </a:graphic>
+                </wp:inline>
+              </w:drawing>
+            </w:r>
+          </w:p>
+        </w:tc>
+        <w:tc>
+          <w:tcPr>
+            <w:tcW w:type="dxa" w:w="2008"/>
+            <w:vAlign w:val="center"/>
+          </w:tcPr>
+          <w:p>
+            <w:pPr>
+              <w:pStyle w:val="Figure"/>
+              <w:jc w:val="center"/>
+            </w:pPr>
+            <w:r>
+              <w:drawing>
+                <wp:inline xmlns:a="http://schemas.openxmlformats.org/drawingml/2006/main" xmlns:pic="http://schemas.openxmlformats.org/drawingml/2006/picture">
+                  <wp:extent cx="1188720" cy="2852928"/>
+                  <wp:docPr id="2" name="Picture 2" descr="The revised mobile hero prioritizes the estimated result and usable controls before the freight story."/>
+                  <wp:cNvGraphicFramePr>
+                    <a:graphicFrameLocks noChangeAspect="1"/>
+                  </wp:cNvGraphicFramePr>
+                  <a:graphic>
+                    <a:graphicData uri="http://schemas.openxmlformats.org/drawingml/2006/picture">
+                      <pic:pic>
+                        <pic:nvPicPr>
+                          <pic:cNvPr id="0" name="image.jpg"/>
+                          <pic:cNvPicPr/>
+                        </pic:nvPicPr>
+                        <pic:blipFill>
+                          <a:blip r:embed="rId12"/>
+                          <a:stretch>
+                            <a:fillRect/>
+                          </a:stretch>
+                        </pic:blipFill>
+                        <pic:spPr>
+                          <a:xfrm>
+                            <a:off x="0" y="0"/>
+                            <a:ext cx="1188720" cy="2852928"/>
+                          </a:xfrm>
+                          <a:prstGeom prst="rect"/>
+                        </pic:spPr>
+                      </pic:pic>
+                    </a:graphicData>
+                  </a:graphic>
+                </wp:inline>
+              </w:drawing>
+            </w:r>
+          </w:p>
+        </w:tc>
+      </w:tr>
+    </w:tbl>
     <w:p>
       <w:pPr>
         <w:pStyle w:val="Caption"/>
@@ -79,7 +161,7 @@
         <w:t xml:space="preserve">FIG. 01  </w:t>
       </w:r>
       <w:r>
-        <w:t>The opening connects a clear product proposition to an immediate, adjustable freight scenario.</w:t>
+        <w:t>Production-build desktop and mobile captures. The opening connects a freight story to a working decision; the narrow layout gives the estimator priority.</w:t>
       </w:r>
     </w:p>
     <w:p>
@@ -87,13 +169,13 @@
         <w:pStyle w:val="Metric"/>
       </w:pPr>
       <w:r>
-        <w:t>4 transport modes  /  501 company records  /  1 shared engine</w:t>
+        <w:t>4 story chapters  /  4 transport modes  /  501 company records</w:t>
       </w:r>
     </w:p>
     <w:p>
       <w:pPr/>
       <w:r>
-        <w:t>I designed and built a responsive landing page, a shipment-analysis workspace and a real API. The journey moves from a quick carbon estimate to editable shipment data, traceable calculations and useful reporting files.</w:t>
+        <w:t>I built a cinematic landing page around a working shipment-analysis product. The visual revision brings calculation, comparison and evidence into the opening while preserving the company directory, analysis workspace, API and reporting workflow.</w:t>
       </w:r>
     </w:p>
     <w:p>
@@ -125,7 +207,7 @@
         <w:pStyle w:val="PageHeading"/>
       </w:pPr>
       <w:r>
-        <w:t>MAKE THE FIRST TEN SECONDS USEFUL.</w:t>
+        <w:t>TRY THE PRODUCT. KEEP THE CONTEXT.</w:t>
       </w:r>
     </w:p>
     <w:p>
@@ -133,85 +215,131 @@
         <w:pStyle w:val="Lead"/>
       </w:pPr>
       <w:r>
-        <w:t>The opening is designed to create a meaningful action before asking a visitor for a sales conversation.</w:t>
+        <w:t>The landing offers a useful first decision, then opens the evidence behind it.</w:t>
       </w:r>
     </w:p>
-    <w:p>
-      <w:pPr>
-        <w:pStyle w:val="Figure"/>
-      </w:pPr>
-      <w:r>
-        <w:drawing>
-          <wp:inline xmlns:a="http://schemas.openxmlformats.org/drawingml/2006/main" xmlns:pic="http://schemas.openxmlformats.org/drawingml/2006/picture">
-            <wp:extent cx="4114800" cy="2857500"/>
-            <wp:docPr id="2" name="Picture 2" descr="Desktop analytics workspace"/>
-            <wp:cNvGraphicFramePr>
-              <a:graphicFrameLocks noChangeAspect="1"/>
-            </wp:cNvGraphicFramePr>
-            <a:graphic>
-              <a:graphicData uri="http://schemas.openxmlformats.org/drawingml/2006/picture">
-                <pic:pic>
-                  <pic:nvPicPr>
-                    <pic:cNvPr id="0" name="demo-desktop.jpg"/>
-                    <pic:cNvPicPr/>
-                  </pic:nvPicPr>
-                  <pic:blipFill>
-                    <a:blip r:embed="rId12"/>
-                    <a:stretch>
-                      <a:fillRect/>
-                    </a:stretch>
-                  </pic:blipFill>
-                  <pic:spPr>
-                    <a:xfrm>
-                      <a:off x="0" y="0"/>
-                      <a:ext cx="4114800" cy="2857500"/>
-                    </a:xfrm>
-                    <a:prstGeom prst="rect"/>
-                  </pic:spPr>
-                </pic:pic>
-              </a:graphicData>
-            </a:graphic>
-          </wp:inline>
-        </w:drawing>
-      </w:r>
-      <w:r>
-        <w:t xml:space="preserve">  </w:t>
-      </w:r>
-      <w:r>
-        <w:drawing>
-          <wp:inline xmlns:a="http://schemas.openxmlformats.org/drawingml/2006/main" xmlns:pic="http://schemas.openxmlformats.org/drawingml/2006/picture">
-            <wp:extent cx="1188720" cy="2852928"/>
-            <wp:docPr id="3" name="Picture 3" descr="Responsive TEMT page on a mobile viewport"/>
-            <wp:cNvGraphicFramePr>
-              <a:graphicFrameLocks noChangeAspect="1"/>
-            </wp:cNvGraphicFramePr>
-            <a:graphic>
-              <a:graphicData uri="http://schemas.openxmlformats.org/drawingml/2006/picture">
-                <pic:pic>
-                  <pic:nvPicPr>
-                    <pic:cNvPr id="0" name="hero-mobile.jpg"/>
-                    <pic:cNvPicPr/>
-                  </pic:nvPicPr>
-                  <pic:blipFill>
-                    <a:blip r:embed="rId13"/>
-                    <a:stretch>
-                      <a:fillRect/>
-                    </a:stretch>
-                  </pic:blipFill>
-                  <pic:spPr>
-                    <a:xfrm>
-                      <a:off x="0" y="0"/>
-                      <a:ext cx="1188720" cy="2852928"/>
-                    </a:xfrm>
-                    <a:prstGeom prst="rect"/>
-                  </pic:spPr>
-                </pic:pic>
-              </a:graphicData>
-            </a:graphic>
-          </wp:inline>
-        </w:drawing>
-      </w:r>
-    </w:p>
+    <w:tbl>
+      <w:tblPr>
+        <w:tblW w:type="dxa" w:w="9360"/>
+        <w:tblLayout w:type="fixed"/>
+        <w:tblLook w:firstColumn="1" w:firstRow="1" w:lastColumn="0" w:lastRow="0" w:noHBand="0" w:noVBand="1" w:val="04A0"/>
+        <w:tblCellMar>
+          <w:top w:w="0" w:type="dxa"/>
+          <w:bottom w:w="0" w:type="dxa"/>
+          <w:start w:w="0" w:type="dxa"/>
+          <w:end w:w="0" w:type="dxa"/>
+        </w:tblCellMar>
+        <w:tblBorders>
+          <w:top w:val="nil"/>
+          <w:bottom w:val="nil"/>
+          <w:left w:val="nil"/>
+          <w:right w:val="nil"/>
+          <w:insideH w:val="nil"/>
+          <w:insideV w:val="nil"/>
+        </w:tblBorders>
+      </w:tblPr>
+      <w:tblGrid>
+        <w:gridCol w:w="4680"/>
+        <w:gridCol w:w="4680"/>
+      </w:tblGrid>
+      <w:tr>
+        <w:trPr>
+          <w:cantSplit/>
+        </w:trPr>
+        <w:tc>
+          <w:tcPr>
+            <w:tcW w:type="dxa" w:w="4680"/>
+            <w:vAlign w:val="center"/>
+          </w:tcPr>
+          <w:p>
+            <w:pPr>
+              <w:pStyle w:val="Figure"/>
+              <w:jc w:val="center"/>
+            </w:pPr>
+            <w:r>
+              <w:drawing>
+                <wp:inline xmlns:a="http://schemas.openxmlformats.org/drawingml/2006/main" xmlns:pic="http://schemas.openxmlformats.org/drawingml/2006/picture">
+                  <wp:extent cx="2779776" cy="1930400"/>
+                  <wp:docPr id="3" name="Picture 3" descr="Interactive landing analytics calculated from the synthetic FMCG sample, with mode and month views."/>
+                  <wp:cNvGraphicFramePr>
+                    <a:graphicFrameLocks noChangeAspect="1"/>
+                  </wp:cNvGraphicFramePr>
+                  <a:graphic>
+                    <a:graphicData uri="http://schemas.openxmlformats.org/drawingml/2006/picture">
+                      <pic:pic>
+                        <pic:nvPicPr>
+                          <pic:cNvPr id="0" name="image.jpg"/>
+                          <pic:cNvPicPr/>
+                        </pic:nvPicPr>
+                        <pic:blipFill>
+                          <a:blip r:embed="rId13"/>
+                          <a:stretch>
+                            <a:fillRect/>
+                          </a:stretch>
+                        </pic:blipFill>
+                        <pic:spPr>
+                          <a:xfrm>
+                            <a:off x="0" y="0"/>
+                            <a:ext cx="2779776" cy="1930400"/>
+                          </a:xfrm>
+                          <a:prstGeom prst="rect"/>
+                        </pic:spPr>
+                      </pic:pic>
+                    </a:graphicData>
+                  </a:graphic>
+                </wp:inline>
+              </w:drawing>
+            </w:r>
+          </w:p>
+        </w:tc>
+        <w:tc>
+          <w:tcPr>
+            <w:tcW w:type="dxa" w:w="4680"/>
+            <w:vAlign w:val="center"/>
+          </w:tcPr>
+          <w:p>
+            <w:pPr>
+              <w:pStyle w:val="Figure"/>
+              <w:jc w:val="center"/>
+            </w:pPr>
+            <w:r>
+              <w:drawing>
+                <wp:inline xmlns:a="http://schemas.openxmlformats.org/drawingml/2006/main" xmlns:pic="http://schemas.openxmlformats.org/drawingml/2006/picture">
+                  <wp:extent cx="2779776" cy="1930400"/>
+                  <wp:docPr id="4" name="Picture 4" descr="The enterprise workspace shows shipment totals, analytics and an editable ledger."/>
+                  <wp:cNvGraphicFramePr>
+                    <a:graphicFrameLocks noChangeAspect="1"/>
+                  </wp:cNvGraphicFramePr>
+                  <a:graphic>
+                    <a:graphicData uri="http://schemas.openxmlformats.org/drawingml/2006/picture">
+                      <pic:pic>
+                        <pic:nvPicPr>
+                          <pic:cNvPr id="0" name="demo-desktop.jpg"/>
+                          <pic:cNvPicPr/>
+                        </pic:nvPicPr>
+                        <pic:blipFill>
+                          <a:blip r:embed="rId14"/>
+                          <a:stretch>
+                            <a:fillRect/>
+                          </a:stretch>
+                        </pic:blipFill>
+                        <pic:spPr>
+                          <a:xfrm>
+                            <a:off x="0" y="0"/>
+                            <a:ext cx="2779776" cy="1930400"/>
+                          </a:xfrm>
+                          <a:prstGeom prst="rect"/>
+                        </pic:spPr>
+                      </pic:pic>
+                    </a:graphicData>
+                  </a:graphic>
+                </wp:inline>
+              </w:drawing>
+            </w:r>
+          </w:p>
+        </w:tc>
+      </w:tr>
+    </w:tbl>
     <w:p>
       <w:pPr>
         <w:pStyle w:val="Caption"/>
@@ -223,7 +351,7 @@
         <w:t xml:space="preserve">FIG. 02  </w:t>
       </w:r>
       <w:r>
-        <w:t>Desktop workspace and mobile layout. The same product journey adapts to available space, with readable inputs and direct actions.</w:t>
+        <w:t>Production-build landing analytics and the existing public workspace expose the same synthetic FMCG sample at different levels of detail.</w:t>
       </w:r>
     </w:p>
     <w:p>
@@ -232,10 +360,10 @@
         <w:rPr>
           <w:b/>
         </w:rPr>
-        <w:t xml:space="preserve">Recognize the problem. </w:t>
+        <w:t xml:space="preserve">Follow the story. </w:t>
       </w:r>
       <w:r>
-        <w:t>Condensed headlines, freight photography and an orange action color create hierarchy. The primary CTA opens a working scenario; the secondary CTA explains the platform.</w:t>
+        <w:t>Connect, Measure, Compare and Report chapters link inputs to a baseline, an alternative and reporting evidence. Pause and manual chapter selection keep the pace in the visitor's hands.</w:t>
       </w:r>
     </w:p>
     <w:p>
@@ -244,10 +372,10 @@
         <w:rPr>
           <w:b/>
         </w:rPr>
-        <w:t xml:space="preserve">Try a decision. </w:t>
+        <w:t xml:space="preserve">Carry the decision forward. </w:t>
       </w:r>
       <w:r>
-        <w:t>The road-to-rail slider recalculates immediately. Four mode tabs expose their assumptions, and sector presets give enterprise teams a relevant starting point.</w:t>
+        <w:t>Freight weight, distance and rail share recalculate immediately. The primary CTA carries all three through the URL into an editable monthly road baseline and its mode-shift comparison.</w:t>
       </w:r>
     </w:p>
     <w:p>
@@ -256,10 +384,10 @@
         <w:rPr>
           <w:b/>
         </w:rPr>
-        <w:t xml:space="preserve">Stay in context. </w:t>
+        <w:t xml:space="preserve">Inspect the detail. </w:t>
       </w:r>
       <w:r>
-        <w:t>Search real company names or choose an industry. Edit shipment legs and compare the resulting analytics without losing the scenario context.</w:t>
+        <w:t>Sector examples show calculated shipment legs and mode contributions. The landing report switches between modes and months, with exact chart data available before opening the full workspace.</w:t>
       </w:r>
     </w:p>
     <w:p>
@@ -267,7 +395,7 @@
         <w:pStyle w:val="Small"/>
       </w:pPr>
       <w:r>
-        <w:t>Design decision: motion signals interaction and progress. Reduced-motion preferences, keyboard operation and clear focus states support practical access.</w:t>
+        <w:t>Motion pauses when the hero leaves view or the tab is hidden. Reduced-motion and supported data-saving preferences use manual playback. Native inputs, keyboard tabs and visible focus support access.</w:t>
       </w:r>
     </w:p>
     <w:p>
@@ -311,7 +439,7 @@
         <w:drawing>
           <wp:inline xmlns:a="http://schemas.openxmlformats.org/drawingml/2006/main" xmlns:pic="http://schemas.openxmlformats.org/drawingml/2006/picture">
             <wp:extent cx="4608576" cy="3200400"/>
-            <wp:docPr id="4" name="Picture 4" descr="TEMT shipment processing interface showing inputs, validation, calculation progress and outputs."/>
+            <wp:docPr id="5" name="Picture 5" descr="TEMT shipment processing interface showing inputs, validation, calculation progress and outputs."/>
             <wp:cNvGraphicFramePr>
               <a:graphicFrameLocks noChangeAspect="1"/>
             </wp:cNvGraphicFramePr>
@@ -319,11 +447,11 @@
               <a:graphicData uri="http://schemas.openxmlformats.org/drawingml/2006/picture">
                 <pic:pic>
                   <pic:nvPicPr>
-                    <pic:cNvPr id="0" name="pipeline-desktop.jpg"/>
+                    <pic:cNvPr id="0" name="image.jpg"/>
                     <pic:cNvPicPr/>
                   </pic:nvPicPr>
                   <pic:blipFill>
-                    <a:blip r:embed="rId14"/>
+                    <a:blip r:embed="rId15"/>
                     <a:stretch>
                       <a:fillRect/>
                     </a:stretch>
@@ -353,7 +481,7 @@
         <w:t xml:space="preserve">FIG. 03  </w:t>
       </w:r>
       <w:r>
-        <w:t>The working pipeline makes inputs, processing and outcomes inspectable. Invalid shipment data is surfaced before it enters totals.</w:t>
+        <w:t>Production-build pipeline, with the valid sample completed. The missing-load control lets the visitor inspect how an exception changes the total.</w:t>
       </w:r>
     </w:p>
     <w:p>
@@ -365,7 +493,7 @@
         <w:t xml:space="preserve">Validate. </w:t>
       </w:r>
       <w:r>
-        <w:t>CSV import and an editable ledger support multi-leg shipments. Invalid, duplicate or missing legs exclude the identifiable shipment until corrected; exceptions remain visible.</w:t>
+        <w:t>Toggle a missing load, then run the three-row sample. The complete two-leg shipment is excluded until corrected. The calculation trail shows accepted rows and validation exceptions.</w:t>
       </w:r>
     </w:p>
     <w:p>
@@ -377,7 +505,7 @@
         <w:t xml:space="preserve">Calculate. </w:t>
       </w:r>
       <w:r>
-        <w:t>Each accepted leg uses tonnes × kilometres × a published WTW factor. Browser and API share the same unrounded TypeScript calculation, then aggregate by mode, month and subsidiary.</w:t>
+        <w:t>Each accepted leg uses tonnes × kilometres × a published WTW factor. The full browser and API engines share unrounded TypeScript calculations; accepted legs aggregate by mode, month and subsidiary.</w:t>
       </w:r>
     </w:p>
     <w:p>
@@ -441,7 +569,7 @@
         <w:t xml:space="preserve">01 / Static frontend. </w:t>
       </w:r>
       <w:r>
-        <w:t>Next.js, React and Tailwind export to Render's CDN. Locally hosted assets, Motion, Recharts and Lucide shape the responsive experience.</w:t>
+        <w:t>Next.js, React and Tailwind export to Render's CDN. Local image and font assets, CSS animation, SVG scenes, Recharts and Lucide shape the experience.</w:t>
       </w:r>
     </w:p>
     <w:p>
@@ -565,7 +693,7 @@
               <w:rPr>
                 <w:b w:val="0"/>
               </w:rPr>
-              <w:t>89 passed</w:t>
+              <w:t>112 passed</w:t>
             </w:r>
           </w:p>
         </w:tc>
@@ -673,7 +801,7 @@
               <w:rPr>
                 <w:b w:val="0"/>
               </w:rPr>
-              <w:t>32-leg parity; 4.925 ms engine</w:t>
+              <w:t>Exact 1-leg parity; 1.82 ms engine</w:t>
             </w:r>
           </w:p>
         </w:tc>
@@ -709,7 +837,7 @@
               <w:rPr>
                 <w:b w:val="0"/>
               </w:rPr>
-              <w:t>97 desktop / 87 mobile</w:t>
+              <w:t>100 desktop / 91 mobile</w:t>
             </w:r>
           </w:p>
         </w:tc>
@@ -781,7 +909,7 @@
               <w:rPr>
                 <w:b w:val="0"/>
               </w:rPr>
-              <w:t>1.1 s desktop / 2.7 s mobile</w:t>
+              <w:t>0.6 s desktop / 2.9 s mobile</w:t>
             </w:r>
           </w:p>
         </w:tc>
@@ -817,7 +945,7 @@
               <w:rPr>
                 <w:b w:val="0"/>
               </w:rPr>
-              <w:t>0 ms desktop / 350 ms mobile</w:t>
+              <w:t>0 ms desktop / 50 ms mobile</w:t>
             </w:r>
           </w:p>
         </w:tc>
@@ -872,7 +1000,7 @@
         <w:pStyle w:val="Small"/>
       </w:pPr>
       <w:r>
-        <w:t>Lighthouse 13.4.1 against the public site, 14 September 2026. Mobile: 4× CPU slowdown, 150 ms RTT; shared-machine load can affect these lab results. Latest mobile performance: 87/100; the 90 target was not met. These are not field measurements.</w:t>
+        <w:t>Lighthouse 13.4.1 on the public site, 14 September 2026. Mobile: simulated 4× CPU slowdown, 150 ms RTT. Project performance floors of 95 desktop and 90 mobile were met. These are lab observations, not field measurements.</w:t>
       </w:r>
     </w:p>
     <w:p>
@@ -880,7 +1008,7 @@
         <w:pStyle w:val="Small"/>
       </w:pPr>
       <w:r>
-        <w:t>Warm API observation: 32 legs, 24 shipments; 146.06 ms including connection and transfer. Browser/server output matched exactly. This is not a cold-start measurement.</w:t>
+        <w:t>Warm quick-scenario API: 66,300 kgCO₂e; 112.83 ms including response transfer, 1.82 ms engine. Exact client/server parity. Initial health request: 23.25 s with unknown prior idle time, not a controlled cold-start test.</w:t>
       </w:r>
     </w:p>
     <w:p>
@@ -893,7 +1021,7 @@
       <w:pPr>
         <w:pStyle w:val="Small"/>
       </w:pPr>
-      <w:hyperlink r:id="rId15">
+      <w:hyperlink r:id="rId16">
         <w:r>
           <w:rPr>
             <w:color w:val="C6471D"/>
@@ -939,7 +1067,7 @@
       <w:pPr>
         <w:pStyle w:val="Link"/>
       </w:pPr>
-      <w:hyperlink r:id="rId16">
+      <w:hyperlink r:id="rId17">
         <w:r>
           <w:rPr>
             <w:color w:val="C6471D"/>
@@ -953,7 +1081,7 @@
       <w:pPr>
         <w:pStyle w:val="Link"/>
       </w:pPr>
-      <w:hyperlink r:id="rId17">
+      <w:hyperlink r:id="rId18">
         <w:r>
           <w:rPr>
             <w:color w:val="C6471D"/>
@@ -967,7 +1095,7 @@
       <w:pPr>
         <w:pStyle w:val="Link"/>
       </w:pPr>
-      <w:hyperlink r:id="rId18">
+      <w:hyperlink r:id="rId19">
         <w:r>
           <w:rPr>
             <w:color w:val="C6471D"/>
@@ -981,7 +1109,7 @@
       <w:pPr>
         <w:pStyle w:val="Link"/>
       </w:pPr>
-      <w:hyperlink r:id="rId19">
+      <w:hyperlink r:id="rId20">
         <w:r>
           <w:rPr>
             <w:color w:val="C6471D"/>
@@ -995,7 +1123,7 @@
       <w:pPr>
         <w:pStyle w:val="Link"/>
       </w:pPr>
-      <w:hyperlink r:id="rId20">
+      <w:hyperlink r:id="rId21">
         <w:r>
           <w:rPr>
             <w:color w:val="C6471D"/>
@@ -1009,7 +1137,7 @@
       <w:pPr>
         <w:pStyle w:val="Link"/>
       </w:pPr>
-      <w:hyperlink r:id="rId21">
+      <w:hyperlink r:id="rId22">
         <w:r>
           <w:rPr>
             <w:color w:val="C6471D"/>
@@ -1057,10 +1185,10 @@
         <w:rPr>
           <w:b/>
         </w:rPr>
-        <w:t xml:space="preserve">Fast first interaction. </w:t>
+        <w:t xml:space="preserve">An expressive, useful opening. </w:t>
       </w:r>
       <w:r>
-        <w:t>A CDN serves the landing page independently of the API. The stateless server demonstrates backend processing; enterprise connectors and persistent workflows remain future integrations.</w:t>
+        <w:t>Four chapters make the freight story visible. The estimator stays usable while the scene plays, and its inputs continue into the workspace. The static landing loads independently of the API.</w:t>
       </w:r>
     </w:p>
     <w:p>
@@ -1075,7 +1203,7 @@
       <w:pPr>
         <w:pStyle w:val="Small"/>
       </w:pPr>
-      <w:hyperlink r:id="rId22">
+      <w:hyperlink r:id="rId23">
         <w:r>
           <w:rPr>
             <w:color w:val="C6471D"/>
@@ -1089,7 +1217,7 @@
       <w:pPr>
         <w:pStyle w:val="Small"/>
       </w:pPr>
-      <w:hyperlink r:id="rId23">
+      <w:hyperlink r:id="rId24">
         <w:r>
           <w:rPr>
             <w:color w:val="C6471D"/>
@@ -1103,7 +1231,7 @@
       <w:pPr>
         <w:pStyle w:val="Small"/>
       </w:pPr>
-      <w:hyperlink r:id="rId24">
+      <w:hyperlink r:id="rId25">
         <w:r>
           <w:rPr>
             <w:color w:val="C6471D"/>
@@ -1117,7 +1245,7 @@
       <w:pPr>
         <w:pStyle w:val="Small"/>
       </w:pPr>
-      <w:hyperlink r:id="rId25">
+      <w:hyperlink r:id="rId26">
         <w:r>
           <w:rPr>
             <w:color w:val="C6471D"/>
@@ -1132,7 +1260,7 @@
         <w:pStyle w:val="Small"/>
       </w:pPr>
       <w:r>
-        <w:t>Full source register: docs/SOURCES.md in the repository. Photography: CHUTTERSNAP / Unsplash. Fonts: Barlow Condensed, Manrope and IBM Plex Mono under their included licenses.</w:t>
+        <w:t>Sources and design rationale: docs/SOURCES.md and docs/ux-research.md. Photography: CHUTTERSNAP / Unsplash. Fonts: Barlow Condensed, Manrope and IBM Plex Mono under their included licenses.</w:t>
       </w:r>
     </w:p>
     <w:p>
@@ -1140,7 +1268,7 @@
         <w:pStyle w:val="Small"/>
       </w:pPr>
       <w:r>
-        <w:t>Validated release 63bcf04 / 14 September 2026</w:t>
+        <w:t>Validated release 81f7a0b / 14 September 2026</w:t>
       </w:r>
     </w:p>
     <w:sectPr>

</xml_diff>

<commit_message>
Focus design document and documentation on the assignment
</commit_message>
<xml_diff>
--- a/apps/web/public/downloads/TEMT-Product-Case-Study.docx
+++ b/apps/web/public/downloads/TEMT-Product-Case-Study.docx
@@ -7,31 +7,13 @@
         <w:pStyle w:val="Title"/>
       </w:pPr>
       <w:r>
-        <w:t>TEMT Enterprise Product Preview</w:t>
-        <w:br/>
-        <w:t>Technical Submission</w:t>
-      </w:r>
-    </w:p>
-    <w:p>
-      <w:pPr>
-        <w:pStyle w:val="Subtitle"/>
-      </w:pPr>
-      <w:r>
-        <w:t>Prepared for Pratham Agarwal, IIM Bangalore</w:t>
-      </w:r>
-    </w:p>
-    <w:p>
-      <w:pPr>
-        <w:pStyle w:val="Small"/>
-      </w:pPr>
-      <w:r>
-        <w:t>Post-meeting submission | 14 September 2026 | Application release 81f7a0b</w:t>
+        <w:t>TEMT: Design and Implementation</w:t>
       </w:r>
     </w:p>
     <w:p>
       <w:pPr/>
       <w:r>
-        <w:t>This submission records the implemented website and freight-emissions demonstration, the reasons for the principal design decisions, and the evidence used to verify the work. The deployed application and editable source are available for review.</w:t>
+        <w:t>This project helps sustainability and supply-chain teams explore freight emissions, compare transport choices and inspect the records behind each estimate. The implementation connects an interactive landing page to a working shipment workspace, analysis API and downloadable reports.</w:t>
       </w:r>
     </w:p>
     <w:p>
@@ -43,7 +25,7 @@
         <w:drawing>
           <wp:inline xmlns:a="http://schemas.openxmlformats.org/drawingml/2006/main" xmlns:pic="http://schemas.openxmlformats.org/drawingml/2006/picture">
             <wp:extent cx="4023360" cy="2794000"/>
-            <wp:docPr id="1" name="Picture 1" descr="Desktop production build showing the Compare chapter and its calculated 16.71 tonne emissions difference."/>
+            <wp:docPr id="1" name="Picture 1" descr="Desktop interface showing the Compare chapter and its calculated 16.71 tonne emissions difference."/>
             <wp:cNvGraphicFramePr>
               <a:graphicFrameLocks noChangeAspect="1"/>
             </wp:cNvGraphicFramePr>
@@ -80,7 +62,7 @@
         <w:drawing>
           <wp:inline xmlns:a="http://schemas.openxmlformats.org/drawingml/2006/main" xmlns:pic="http://schemas.openxmlformats.org/drawingml/2006/picture">
             <wp:extent cx="1005840" cy="2414016"/>
-            <wp:docPr id="2" name="Picture 2" descr="Mobile production build with the estimator and input controls before the illustrative freight scene."/>
+            <wp:docPr id="2" name="Picture 2" descr="Mobile interface with the estimator and input controls before the illustrative freight scene."/>
             <wp:cNvGraphicFramePr>
               <a:graphicFrameLocks noChangeAspect="1"/>
             </wp:cNvGraphicFramePr>
@@ -124,7 +106,7 @@
         <w:t xml:space="preserve">Figure 1. </w:t>
       </w:r>
       <w:r>
-        <w:t>Desktop and mobile views of production build 81f7a0b. The desktop view supports scenario comparison; the mobile view presents inputs before the illustrative scene.</w:t>
+        <w:t>Desktop and mobile views of the interactive estimator. The desktop view supports scenario comparison; the mobile view presents inputs before the illustrative scene.</w:t>
       </w:r>
     </w:p>
     <w:p>
@@ -173,7 +155,7 @@
         </w:r>
       </w:hyperlink>
       <w:r>
-        <w:t xml:space="preserve"> does not certify this separate demonstration engine. No exclusivity or customer relationship is asserted.</w:t>
+        <w:t xml:space="preserve"> covers the original TEMT v1.3 methodology against ISO 14083:2023. This preview uses a separate calculation engine and produces illustrative estimates.</w:t>
       </w:r>
     </w:p>
     <w:p>
@@ -223,7 +205,7 @@
     <w:p>
       <w:pPr/>
       <w:r>
-        <w:t>The browser and server import the same TypeScript calculator, version temt-demo-1.0.0. Each accepted transport leg is evaluated using a published well-to-wheel (WTW) default factor. This includes fuel or energy supply and vehicle operation within the stated factor boundary.</w:t>
+        <w:t>The browser and server import the same shared TypeScript calculator. Each accepted transport leg is evaluated using a published well-to-wheel (WTW) default factor. This includes fuel or energy supply and vehicle operation within the stated factor boundary.</w:t>
       </w:r>
     </w:p>
     <w:p>
@@ -760,7 +742,7 @@
         <w:t xml:space="preserve">Figure 2. </w:t>
       </w:r>
       <w:r>
-        <w:t>Production-build validation example: three accepted legs across two shipments produce 1,394.33 kg CO2e. The missing-load control is visible but inactive.</w:t>
+        <w:t>Validation example: three accepted legs across two shipments produce 1,394.33 kg CO2e. The missing-load control is visible but inactive.</w:t>
       </w:r>
     </w:p>
     <w:p>
@@ -1138,7 +1120,7 @@
         <w:t xml:space="preserve">Figure 3. </w:t>
       </w:r>
       <w:r>
-        <w:t>Landing reporting from production build 81f7a0b, and the retained public workspace capture. The visible FMCG dataset is unchanged: 24 shipments, 32 legs and 453.64 t CO2e.</w:t>
+        <w:t>Landing analytics and the shipment workspace show the same FMCG sample: 24 shipments, 32 legs and 453.64 t CO2e.</w:t>
       </w:r>
     </w:p>
     <w:p>
@@ -1166,7 +1148,7 @@
         <w:t xml:space="preserve">Interaction and accessibility. </w:t>
       </w:r>
       <w:r>
-        <w:t>Connect, Measure, Compare and Report chapters provide context without blocking the estimator. Playback has pause and manual controls, pauses off-screen or in a hidden tab, and uses manual playback for reduced-motion or supported data-saving preferences. Mobile layouts prioritise the result and native input controls. These are design decisions, not evidence of conversion improvement.</w:t>
+        <w:t xml:space="preserve">Connect, Measure, Compare and Report chapters provide context without blocking the estimator. Playback has pause and manual controls, pauses off-screen or in a hidden tab, and uses manual playback for reduced-motion or supported data-saving preferences. Mobile layouts prioritise the result and native input controls. </w:t>
       </w:r>
     </w:p>
     <w:p>
@@ -1196,26 +1178,13 @@
         <w:pStyle w:val="PageHeading"/>
       </w:pPr>
       <w:r>
-        <w:t>4. Verification, delivery and next steps</w:t>
+        <w:t>4. Verification and further development</w:t>
       </w:r>
     </w:p>
     <w:p>
       <w:pPr/>
       <w:r>
-        <w:t xml:space="preserve">Release 81f7a0b passed 112 automated tests, TypeScript checks, source-integrity checks and production builds. Tests cover calculator validation, imports/exports, API controls and estimator-to-workspace parity. The </w:t>
-      </w:r>
-      <w:hyperlink r:id="rId20">
-        <w:r>
-          <w:rPr>
-            <w:rFonts w:ascii="Times New Roman" w:hAnsi="Times New Roman" w:eastAsia="Times New Roman" w:cs="Times New Roman"/>
-            <w:color w:val="000000"/>
-            <w:u w:val="single"/>
-          </w:rPr>
-          <w:t>successful CI run</w:t>
-        </w:r>
-      </w:hyperlink>
-      <w:r>
-        <w:t xml:space="preserve"> records the validated application release.</w:t>
+        <w:t>All 112 automated tests passed, alongside TypeScript checks, source-integrity checks and production builds. Tests cover calculator validation, imports and exports, API controls, filter consistency and estimator-to-workspace parity.</w:t>
       </w:r>
     </w:p>
     <w:tbl>
@@ -1705,7 +1674,7 @@
         <w:pStyle w:val="Heading2"/>
       </w:pPr>
       <w:r>
-        <w:t>Review material</w:t>
+        <w:t>Project resources</w:t>
       </w:r>
     </w:p>
     <w:p>
@@ -1725,7 +1694,7 @@
       <w:r>
         <w:t xml:space="preserve">  |  </w:t>
       </w:r>
-      <w:hyperlink r:id="rId21">
+      <w:hyperlink r:id="rId20">
         <w:r>
           <w:rPr>
             <w:rFonts w:ascii="Times New Roman" w:hAnsi="Times New Roman" w:eastAsia="Times New Roman" w:cs="Times New Roman"/>
@@ -1753,7 +1722,7 @@
       <w:pPr>
         <w:pStyle w:val="Link"/>
       </w:pPr>
-      <w:hyperlink r:id="rId22">
+      <w:hyperlink r:id="rId21">
         <w:r>
           <w:rPr>
             <w:rFonts w:ascii="Times New Roman" w:hAnsi="Times New Roman" w:eastAsia="Times New Roman" w:cs="Times New Roman"/>
@@ -1766,7 +1735,7 @@
       <w:r>
         <w:t xml:space="preserve">  |  </w:t>
       </w:r>
-      <w:hyperlink r:id="rId23">
+      <w:hyperlink r:id="rId22">
         <w:r>
           <w:rPr>
             <w:rFonts w:ascii="Times New Roman" w:hAnsi="Times New Roman" w:eastAsia="Times New Roman" w:cs="Times New Roman"/>
@@ -1779,7 +1748,7 @@
       <w:r>
         <w:t xml:space="preserve">  |  </w:t>
       </w:r>
-      <w:hyperlink r:id="rId24">
+      <w:hyperlink r:id="rId23">
         <w:r>
           <w:rPr>
             <w:rFonts w:ascii="Times New Roman" w:hAnsi="Times New Roman" w:eastAsia="Times New Roman" w:cs="Times New Roman"/>
@@ -1795,7 +1764,7 @@
         <w:pStyle w:val="Small"/>
       </w:pPr>
       <w:r>
-        <w:t>The repository retains source references, UX rationale, test records, raw Lighthouse JSON and the API measurement file in docs/. Screenshots document the interface; four show the local production build, while the unchanged workspace capture is from the prior public release.</w:t>
+        <w:t>The repository includes setup instructions, deployment configuration, source references, design rationale, test records and raw performance measurements. The screenshots show the implemented interface and sample data.</w:t>
       </w:r>
     </w:p>
     <w:p>
@@ -1803,26 +1772,26 @@
         <w:pStyle w:val="Heading2"/>
       </w:pPr>
       <w:r>
-        <w:t>Proposed production work and limitations</w:t>
+        <w:t>Further development</w:t>
       </w:r>
     </w:p>
     <w:p>
       <w:pPr/>
       <w:r>
-        <w:t>Before enterprise use, proposed work includes SSO and role-based access, tenant isolation, governed factor updates, persistent audit trails, reviewed data retention, approved logistics integrations, monitored paid capacity and repeatable load testing. None of these controls is represented as implemented in this stateless preview.</w:t>
+        <w:t>Before enterprise use, proposed work includes SSO and role-based access, tenant isolation, governed factor updates, persistent audit trails, reviewed data retention, approved logistics integrations, monitored paid capacity and repeatable load testing. The current preview is stateless and requires no customer credentials.</w:t>
       </w:r>
     </w:p>
     <w:p>
       <w:pPr/>
       <w:r>
-        <w:t>Default-factor scenarios are not carrier measurements, a complete corporate inventory, or assured reporting. Production decisions require verified activity data and reviewed methodological boundaries. Partner references, company names and original-product certification do not establish integration, endorsement or certification of this demonstration.</w:t>
+        <w:t xml:space="preserve">Default-factor scenarios are not carrier measurements, a complete corporate inventory, or assured reporting. Production decisions require verified activity data and reviewed methodological boundaries. </w:t>
       </w:r>
     </w:p>
     <w:p>
       <w:pPr>
         <w:pStyle w:val="Small"/>
       </w:pPr>
-      <w:hyperlink r:id="rId25">
+      <w:hyperlink r:id="rId24">
         <w:r>
           <w:rPr>
             <w:rFonts w:ascii="Times New Roman" w:hAnsi="Times New Roman" w:eastAsia="Times New Roman" w:cs="Times New Roman"/>
@@ -1835,7 +1804,7 @@
       <w:r>
         <w:t xml:space="preserve">  |  </w:t>
       </w:r>
-      <w:hyperlink r:id="rId26">
+      <w:hyperlink r:id="rId25">
         <w:r>
           <w:rPr>
             <w:rFonts w:ascii="Times New Roman" w:hAnsi="Times New Roman" w:eastAsia="Times New Roman" w:cs="Times New Roman"/>
@@ -1868,8 +1837,6 @@
       </w:tabs>
     </w:pPr>
     <w:r>
-      <w:t>14 September 2026</w:t>
-      <w:tab/>
       <w:t xml:space="preserve">Page </w:t>
     </w:r>
     <w:r/>
@@ -1891,9 +1858,7 @@
       </w:tabs>
     </w:pPr>
     <w:r>
-      <w:t>TEMT Technical Submission</w:t>
-      <w:tab/>
-      <w:t>IIM Bangalore</w:t>
+      <w:t>TEMT Design Document</w:t>
     </w:r>
   </w:p>
 </w:hdr>

</xml_diff>